<commit_message>
calificaciones e infracciones terminado
</commit_message>
<xml_diff>
--- a/diagrama/Casos de uso/Formatos Casos de uso/Formato_GestionarEquipo.docx
+++ b/diagrama/Casos de uso/Formatos Casos de uso/Formato_GestionarEquipo.docx
@@ -84,7 +84,15 @@
                 <w:color w:val="000000"/>
                 <w:lang w:eastAsia="es-CO"/>
               </w:rPr>
-              <w:t>Confirmar equipos</w:t>
+              <w:t>gestionar</w:t>
+            </w:r>
+            <w:r>
+              <w:rPr>
+                <w:rFonts w:ascii="Arial" w:eastAsia="Times New Roman" w:hAnsi="Arial" w:cs="Arial"/>
+                <w:color w:val="000000"/>
+                <w:lang w:eastAsia="es-CO"/>
+              </w:rPr>
+              <w:t xml:space="preserve"> equipos</w:t>
             </w:r>
           </w:p>
         </w:tc>
@@ -1631,25 +1639,7 @@
                 <w:color w:val="000000"/>
                 <w:lang w:eastAsia="es-CO"/>
               </w:rPr>
-              <w:t>un “</w:t>
-            </w:r>
-            <w:proofErr w:type="spellStart"/>
-            <w:r>
-              <w:rPr>
-                <w:rFonts w:ascii="Arial" w:eastAsia="Times New Roman" w:hAnsi="Arial" w:cs="Arial"/>
-                <w:color w:val="000000"/>
-                <w:lang w:eastAsia="es-CO"/>
-              </w:rPr>
-              <w:t>check</w:t>
-            </w:r>
-            <w:proofErr w:type="spellEnd"/>
-            <w:r>
-              <w:rPr>
-                <w:rFonts w:ascii="Arial" w:eastAsia="Times New Roman" w:hAnsi="Arial" w:cs="Arial"/>
-                <w:color w:val="000000"/>
-                <w:lang w:eastAsia="es-CO"/>
-              </w:rPr>
-              <w:t>”</w:t>
+              <w:t>un “check”</w:t>
             </w:r>
             <w:r>
               <w:rPr>

</xml_diff>